<commit_message>
Auto sync 20251007 140734
</commit_message>
<xml_diff>
--- a/Безопасность информационных систем и технологий/Королёв_БИ/Отчет по лабораторной 3.docx
+++ b/Безопасность информационных систем и технологий/Королёв_БИ/Отчет по лабораторной 3.docx
@@ -398,8 +398,10 @@
               <w:t xml:space="preserve">___________________ </w:t>
             </w:r>
             <w:r>
-              <w:t>Мартынов В.А.</w:t>
+              <w:t>Королев Ф.О.</w:t>
             </w:r>
+            <w:bookmarkStart w:id="0" w:name="_GoBack"/>
+            <w:bookmarkEnd w:id="0"/>
             <w:r>
               <w:t xml:space="preserve"> </w:t>
             </w:r>
@@ -1070,8 +1072,6 @@
       <w:r>
         <w:t>содержании фамилии в пароле</w:t>
       </w:r>
-      <w:bookmarkStart w:id="0" w:name="_GoBack"/>
-      <w:bookmarkEnd w:id="0"/>
     </w:p>
     <w:p>
       <w:pPr>

</xml_diff>